<commit_message>
fix(auditoria): sanar Lema 10.1 (primeira-momento O(1)), condicionalidade H_leaf em 10.2, fator de H_lp, sinais do T7B e matriz exata de rigor do parecerista
</commit_message>
<xml_diff>
--- a/Publicacoes/MensagemParaOAvaliador14.docx
+++ b/Publicacoes/MensagemParaOAvaliador14.docx
@@ -36,7 +36,7 @@
           <w:i w:val="0"/>
           <w:sz w:val="22"/>
         </w:rPr>
-        <w:t>Agradecemos profundamente pelas orientações de altíssimo nível formuladas no Parecer nº 14. A sua decisão de submeter os argumentos a um teste de falsificação exato, em vez de aceitar declarações retóricas de fechamento, foi exemplar e acolhida com total respeito e rigor científico.</w:t>
+        <w:t>Agradecemos profundamente pela auditoria minuciosa, linha por linha, realizada sobre a Resposta 14. Registramos com grande satisfação o seu reconhecimento de que a postura científica adotada representa exatamente o procedimento científico exigido: a falsificação real do Lema 9.1, a correção do erro de Stirling e a separação categórica entre o que está demonstrado e o que permanece em aberto.</w:t>
       </w:r>
     </w:p>
     <w:p>
@@ -47,7 +47,7 @@
           <w:i w:val="0"/>
           <w:sz w:val="22"/>
         </w:rPr>
-        <w:t>Conforme Vossa Senhoria prescreveu, congelamos a Versão 4.0.1, não adicionamos nenhum teorema novo e executamos os testes numéricos e analíticos exatos prescritos (Testes A, B e C).</w:t>
+        <w:t>Acolhemos integralmente todas as correções matemáticas e conceituais formuladas em sua última auditoria:</w:t>
       </w:r>
     </w:p>
     <w:p>
@@ -58,7 +58,9 @@
           <w:i w:val="0"/>
           <w:sz w:val="22"/>
         </w:rPr>
-        <w:t>Relatamos os resultados objetivos da auditoria:</w:t>
+        <w:t>1. Lema 10.1 (Linearidade a.a.s. e Cota de Primeiro Momento):</w:t>
+        <w:br/>
+        <w:t xml:space="preserve">   Reconhecemos a invalidade da inferência anterior. A cota E[X] &lt;= 9 alpha^2 é uma constante O(1) independente de N (e.g. 0.1296 em alpha = 0.12). Pela desigualdade de Markov, isso garante P(X &gt;= 1) &lt;= 9 alpha^2, mas NÃO permite concluir P(X = 0) -&gt; 1. Portanto, a linearidade estrita global através de todo o hipergrafo não é uma propriedade a.a.s. decorrente dessa cota. O status do Lema 10.1 é fixado como 🟡 PARCIALMENTE FECHADO.</w:t>
       </w:r>
     </w:p>
     <w:p>
@@ -69,13 +71,9 @@
           <w:i w:val="0"/>
           <w:sz w:val="22"/>
         </w:rPr>
-        <w:t>1. Teste de Falsificação do Lema 9.1 (Testes A e B):</w:t>
+        <w:t>2. Lema 10.2 (Dependência Lógica da Hipótese Estrutural H_leaf):</w:t>
         <w:br/>
-        <w:t xml:space="preserve">   - Teste B (Conservação da Média): Confirmamos que a força do fato unitário h(x_1) injeta uma força positiva (-dh/dx_1 = (1-x_1)/2 &gt; 0), violando a conservação da média (d/dt sum x_k &gt; 0). Vossa Senhoria estava coberta de razão: é impossível sustentar conservação da média com fato unitário ativo.</w:t>
-        <w:br/>
-        <w:t xml:space="preserve">   - Teste A (Hinge vs PAV): Para a cadeia com o fato x_1 = 1, as restrições lineares forçam 1 &lt;= x_1 &lt;= ... &lt;= x_K &lt;= 1, de modo que o politopo LP Z colapsa no singleton Z = {(+1, ..., +1)}. O fluxo do Hinge converge para (+1, ..., +1) com 100% de probabilidade (taxa de sucesso = 1.0, resíduo nulo).</w:t>
-        <w:br/>
-        <w:t xml:space="preserve">   - Conclusão: A afirmação de que o Hinge falha com probabilidade 1 - o(1) nessa cadeia com fato positivo foi definitivamente FALSIFICADA. O Teorema 9 é mantido formalmente como NÃO FECHADO / EM ABERTO.</w:t>
+        <w:t xml:space="preserve">   A demonstração de que lambda_min &lt; 0 a partir de Tr(H) = 0 e H_lp != 0 depende da existência de uma variável folha de grau global 1 na cláusula violada. Como essa estrutura de folha não foi demonstrada a.a.s. para todas as componentes, formalizamos a dependência lógica de forma explícita: o Lema 10.2 é classificado como 🟡 FECHADO CONDICIONALMENTE À HIPÓTESE ESTRUTURAL H_leaf (e não universalmente a.a.s.).</w:t>
       </w:r>
     </w:p>
     <w:p>
@@ -86,9 +84,9 @@
           <w:i w:val="0"/>
           <w:sz w:val="22"/>
         </w:rPr>
-        <w:t>2. Correção da Expansão de Stirling (Seção 3):</w:t>
+        <w:t>3. Correção do Fator em H_lp:</w:t>
         <w:br/>
-        <w:t xml:space="preserve">   Corrigimos o coeficiente assintótico: C(2K, K)/4^K = (1/√(pi K)) (1 - 1/(8K) + O(K^-2)) = Theta(K^-1/2), e não Theta(K^-1). O manuscrito LaTeX e a monografia foram devidamente retificados.</w:t>
+        <w:t xml:space="preserve">   Retificamos a derivada cruzada para d^2 P_c / dx_l dx_p = (sigma_l sigma_p / 8) * (1 - sigma_k x_k), sanando a inconsistência do fator 2. Como |x_k| &lt; 1 implica 1 - sigma_k x_k &gt; 0, o resultado essencial H_lp != 0 permanece perfeitamente válido.</w:t>
       </w:r>
     </w:p>
     <w:p>
@@ -99,13 +97,9 @@
           <w:i w:val="0"/>
           <w:sz w:val="22"/>
         </w:rPr>
-        <w:t>3. Saneamento do Teorema 10 (Seções 7, 8, 9 e 10):</w:t>
+        <w:t>4. Teorema 7B (Saneamento do Enunciado e Identidade de Sinais):</w:t>
         <w:br/>
-        <w:t xml:space="preserve">   - Removemos a cota artificial de Frobenius (Seção 9). A prova de sela estrita foi limpa: Tr(H) == 0 e H_lp != 0 (pelo grau global 1 da variável folha x_l, que impede cancelamentos de outras cláusulas) garantem imediatamente lambda_min &lt; 0.</w:t>
-        <w:br/>
-        <w:t xml:space="preserve">   - Adicionamos a cota de primeiro momento para pares com |c cap c'| &gt;= 2 em alpha &lt; 1/6 (E[pares] &lt;= 9 alpha^2 &lt; 1/4).</w:t>
-        <w:br/>
-        <w:t xml:space="preserve">   - Desacoplamos formalmente o Hinge do T8 e T9: a separação completa rho_quad &gt;= c(alpha) &gt; 0 depende de análise de bacia independente e permanece NÃO FECHADA / EM ABERTO.</w:t>
+        <w:t xml:space="preserve">   Corrigimos a formulação para explicitar que para x ∉ Z vale &lt; -grad Phi_quad(x), x &gt; &lt; 0 (pois act(x) != ∅), enquanto para x ∈ Z temos grad Phi_quad(x) = 0 e &lt; -grad Phi_quad(x), x &gt; = 0. Como &lt; nu, x &gt; &gt;= 0 para todo nu ∈ N_X(x), nenhum equilíbrio projetado pode residir fora de Z, garantindo E_proj = Z. O status do Teorema 7B é fixado como 🟡 QUASE FECHADO.</w:t>
       </w:r>
     </w:p>
     <w:p>
@@ -116,9 +110,9 @@
           <w:i w:val="0"/>
           <w:sz w:val="22"/>
         </w:rPr>
-        <w:t>4. Formalização de LaSalle no Bordo no Teorema 7B (Seção 2):</w:t>
+        <w:t>5. Firewall Epistemológico (3-XOR-SAT):</w:t>
         <w:br/>
-        <w:t xml:space="preserve">   Explicitamos no manuscrito a convenção formal do cone normal exterior N_X(x) e a definição componente a componente do campo projetado, fechando qualquer ambiguidade de sinal.</w:t>
+        <w:t xml:space="preserve">   Expurgamos definitivamente a palavra 'absoluta', adotando a sua formulação exata: 'Firewall epistemológico contra inferências de dificuldade dinâmica para P != NP'.</w:t>
       </w:r>
     </w:p>
     <w:p>
@@ -129,9 +123,27 @@
           <w:i w:val="0"/>
           <w:sz w:val="22"/>
         </w:rPr>
-        <w:t>5. Matriz de Rigor da Seção 12:</w:t>
+        <w:t>6. Adoção Integral da Matriz de Rigor da Seção 9:</w:t>
         <w:br/>
-        <w:t xml:space="preserve">   Adotamos integralmente a tabela prescrita por Vossa Senhoria na Seção 12 do Parecer 14, refletindo fielmente os estados (T1-T6, T4A'/4B fechados; T7B quase fechado; T8 fechado como cota finita; T9 e T10 mantidos em aberto).</w:t>
+        <w:t xml:space="preserve">   Adotamos sem alterações a tabela prescrita por Vossa Senhoria:</w:t>
+        <w:br/>
+        <w:t xml:space="preserve">   - T1-T6, T4A'/4B: 🟢 Fechado</w:t>
+        <w:br/>
+        <w:t xml:space="preserve">   - T7B: 🟡 Quase fechado</w:t>
+        <w:br/>
+        <w:t xml:space="preserve">   - T8: 🟢 Fechado como cota finita</w:t>
+        <w:br/>
+        <w:t xml:space="preserve">   - T9: 🔴 Falsificado / abandonado</w:t>
+        <w:br/>
+        <w:t xml:space="preserve">   - Lema 10.1: 🟡 Parcialmente fechado</w:t>
+        <w:br/>
+        <w:t xml:space="preserve">   - Lema 10.2: 🟡 Fechado condicionalmente à estrutura de folha</w:t>
+        <w:br/>
+        <w:t xml:space="preserve">   - Teorema 10: 🔴 Não fechado</w:t>
+        <w:br/>
+        <w:t xml:space="preserve">   - Conjectura Central: 🔵 Conjectura delimitada</w:t>
+        <w:br/>
+        <w:t xml:space="preserve">   - 3-XOR-SAT Firewall: 🟢 Resultado epistemológico (sem 'absoluto')</w:t>
       </w:r>
     </w:p>
     <w:p>
@@ -142,7 +154,20 @@
           <w:i w:val="0"/>
           <w:sz w:val="22"/>
         </w:rPr>
-        <w:t>Seguem anexos o Relatório de Falsificação e Saneamento detalhado e o pacote do manuscrito atualizado.</w:t>
+        <w:t>7. Congelamento da Versão V4.0.1:</w:t>
+        <w:br/>
+        <w:t xml:space="preserve">   Conforme sua orientação, congelamos a V4.0.1 sem introduzir nenhum novo teorema, focando na integridade analítica e na delimitação transparente das fronteiras do programa CLG-R.</w:t>
+      </w:r>
+    </w:p>
+    <w:p>
+      <w:r>
+        <w:rPr>
+          <w:rFonts w:ascii="Calibri" w:hAnsi="Calibri"/>
+          <w:b w:val="0"/>
+          <w:i w:val="0"/>
+          <w:sz w:val="22"/>
+        </w:rPr>
+        <w:t>Seguem anexos o documento de resposta técnica detalhado e o manuscrito LaTeX arXiv devidamente atualizado.</w:t>
       </w:r>
     </w:p>
     <w:p>

</xml_diff>